<commit_message>
missing data imputation and correction
</commit_message>
<xml_diff>
--- a/codebook.docx
+++ b/codebook.docx
@@ -18520,7 +18520,1799 @@
         <w:t xml:space="preserve">— merge, revisionist potential, derived variables, export</w:t>
       </w:r>
     </w:p>
+    <w:p>
+      <w:r>
+        <w:pict>
+          <v:rect style="width:0;height:1.5pt" o:hralign="center" o:hrstd="t" o:hr="t"/>
+        </w:pict>
+      </w:r>
+    </w:p>
     <w:bookmarkEnd w:id="56"/>
+    <w:bookmarkStart w:id="64" w:name="X3d9e4cb93f196607a2f348af0d8681e0de43e3b"/>
+    <w:p>
+      <w:pPr>
+        <w:pStyle w:val="Heading2"/>
+      </w:pPr>
+      <w:r>
+        <w:t xml:space="preserve">16 Appendix D: Imputation Protocol (06_impute_controls.R)</w:t>
+      </w:r>
+    </w:p>
+    <w:bookmarkStart w:id="57" w:name="purpose"/>
+    <w:p>
+      <w:pPr>
+        <w:pStyle w:val="Heading3"/>
+      </w:pPr>
+      <w:r>
+        <w:t xml:space="preserve">16.1 Purpose</w:t>
+      </w:r>
+    </w:p>
+    <w:p>
+      <w:pPr>
+        <w:pStyle w:val="FirstParagraph"/>
+      </w:pPr>
+      <w:r>
+        <w:t xml:space="preserve">The GRAVE-D dataset contains scattered missing values in continuous V-Dem, CINC, and economic control variables due to differences in temporal and geographic coverage across source datasets. Script</w:t>
+      </w:r>
+      <w:r>
+        <w:t xml:space="preserve"> </w:t>
+      </w:r>
+      <w:r>
+        <w:rPr>
+          <w:rStyle w:val="VerbatimChar"/>
+        </w:rPr>
+        <w:t xml:space="preserve">06_impute_controls.R</w:t>
+      </w:r>
+      <w:r>
+        <w:t xml:space="preserve"> </w:t>
+      </w:r>
+      <w:r>
+        <w:t xml:space="preserve">applies a conservative, multi-stage imputation strategy to fill these gaps while preserving the integrity of structurally missing data.</w:t>
+      </w:r>
+    </w:p>
+    <w:bookmarkEnd w:id="57"/>
+    <w:bookmarkStart w:id="58" w:name="what-is-not-imputed"/>
+    <w:p>
+      <w:pPr>
+        <w:pStyle w:val="Heading3"/>
+      </w:pPr>
+      <w:r>
+        <w:t xml:space="preserve">16.2 What Is NOT Imputed</w:t>
+      </w:r>
+    </w:p>
+    <w:p>
+      <w:pPr>
+        <w:pStyle w:val="FirstParagraph"/>
+      </w:pPr>
+      <w:r>
+        <w:t xml:space="preserve">The following variable categories are excluded from all imputation stages. Their missing values are structural — they reflect the absence of data coverage, not random gaps.</w:t>
+      </w:r>
+    </w:p>
+    <w:tbl>
+      <w:tblPr>
+        <w:tblStyle w:val="Table"/>
+        <w:tblW w:type="pct" w:w="5000"/>
+        <w:tblLayout w:type="fixed"/>
+        <w:tblLook w:firstRow="1" w:lastRow="0" w:firstColumn="0" w:lastColumn="0" w:noHBand="0" w:noVBand="0" w:val="0020"/>
+      </w:tblPr>
+      <w:tblGrid>
+        <w:gridCol w:w="2828"/>
+        <w:gridCol w:w="2828"/>
+        <w:gridCol w:w="2262"/>
+      </w:tblGrid>
+      <w:tr>
+        <w:trPr>
+          <w:tblHeader w:val="on"/>
+        </w:trPr>
+        <w:tc>
+          <w:tcPr/>
+          <w:p>
+            <w:pPr>
+              <w:pStyle w:val="Compact"/>
+            </w:pPr>
+            <w:r>
+              <w:t xml:space="preserve">Category</w:t>
+            </w:r>
+          </w:p>
+        </w:tc>
+        <w:tc>
+          <w:tcPr/>
+          <w:p>
+            <w:pPr>
+              <w:pStyle w:val="Compact"/>
+            </w:pPr>
+            <w:r>
+              <w:t xml:space="preserve">Examples</w:t>
+            </w:r>
+          </w:p>
+        </w:tc>
+        <w:tc>
+          <w:tcPr/>
+          <w:p>
+            <w:pPr>
+              <w:pStyle w:val="Compact"/>
+            </w:pPr>
+            <w:r>
+              <w:t xml:space="preserve">Reason</w:t>
+            </w:r>
+          </w:p>
+        </w:tc>
+      </w:tr>
+      <w:tr>
+        <w:tc>
+          <w:tcPr/>
+          <w:p>
+            <w:pPr>
+              <w:pStyle w:val="Compact"/>
+            </w:pPr>
+            <w:r>
+              <w:t xml:space="preserve">Identifiers &amp; keys</w:t>
+            </w:r>
+          </w:p>
+        </w:tc>
+        <w:tc>
+          <w:tcPr/>
+          <w:p>
+            <w:pPr>
+              <w:pStyle w:val="Compact"/>
+            </w:pPr>
+            <w:r>
+              <w:t xml:space="preserve">COWcode_a/b, year, dyad, iso3a/b</w:t>
+            </w:r>
+          </w:p>
+        </w:tc>
+        <w:tc>
+          <w:tcPr/>
+          <w:p>
+            <w:pPr>
+              <w:pStyle w:val="Compact"/>
+            </w:pPr>
+            <w:r>
+              <w:t xml:space="preserve">Complete by construction.</w:t>
+            </w:r>
+          </w:p>
+        </w:tc>
+      </w:tr>
+      <w:tr>
+        <w:tc>
+          <w:tcPr/>
+          <w:p>
+            <w:pPr>
+              <w:pStyle w:val="Compact"/>
+            </w:pPr>
+            <w:r>
+              <w:t xml:space="preserve">FBIC spine</w:t>
+            </w:r>
+          </w:p>
+        </w:tc>
+        <w:tc>
+          <w:tcPr/>
+          <w:p>
+            <w:pPr>
+              <w:pStyle w:val="Compact"/>
+            </w:pPr>
+            <w:r>
+              <w:t xml:space="preserve">bandwidth, economicbandwidth, etc.</w:t>
+            </w:r>
+          </w:p>
+        </w:tc>
+        <w:tc>
+          <w:tcPr/>
+          <w:p>
+            <w:pPr>
+              <w:pStyle w:val="Compact"/>
+            </w:pPr>
+            <w:r>
+              <w:t xml:space="preserve">Complete by construction.</w:t>
+            </w:r>
+          </w:p>
+        </w:tc>
+      </w:tr>
+      <w:tr>
+        <w:tc>
+          <w:tcPr/>
+          <w:p>
+            <w:pPr>
+              <w:pStyle w:val="Compact"/>
+            </w:pPr>
+            <w:r>
+              <w:t xml:space="preserve">Conflict outcomes</w:t>
+            </w:r>
+          </w:p>
+        </w:tc>
+        <w:tc>
+          <w:tcPr/>
+          <w:p>
+            <w:pPr>
+              <w:pStyle w:val="Compact"/>
+            </w:pPr>
+            <w:r>
+              <w:t xml:space="preserve">hihosta, mid_initiated, cold_war</w:t>
+            </w:r>
+          </w:p>
+        </w:tc>
+        <w:tc>
+          <w:tcPr/>
+          <w:p>
+            <w:pPr>
+              <w:pStyle w:val="Compact"/>
+            </w:pPr>
+            <w:r>
+              <w:t xml:space="preserve">Complete or structurally defined.</w:t>
+            </w:r>
+          </w:p>
+        </w:tc>
+      </w:tr>
+      <w:tr>
+        <w:tc>
+          <w:tcPr/>
+          <w:p>
+            <w:pPr>
+              <w:pStyle w:val="Compact"/>
+            </w:pPr>
+            <w:r>
+              <w:t xml:space="preserve">Temporal controls</w:t>
+            </w:r>
+          </w:p>
+        </w:tc>
+        <w:tc>
+          <w:tcPr/>
+          <w:p>
+            <w:pPr>
+              <w:pStyle w:val="Compact"/>
+            </w:pPr>
+            <w:r>
+              <w:t xml:space="preserve">peace_years, t, t², t³</w:t>
+            </w:r>
+          </w:p>
+        </w:tc>
+        <w:tc>
+          <w:tcPr/>
+          <w:p>
+            <w:pPr>
+              <w:pStyle w:val="Compact"/>
+            </w:pPr>
+            <w:r>
+              <w:t xml:space="preserve">Complete by construction.</w:t>
+            </w:r>
+          </w:p>
+        </w:tc>
+      </w:tr>
+      <w:tr>
+        <w:tc>
+          <w:tcPr/>
+          <w:p>
+            <w:pPr>
+              <w:pStyle w:val="Compact"/>
+            </w:pPr>
+            <w:r>
+              <w:t xml:space="preserve">Archigos leader variables</w:t>
+            </w:r>
+          </w:p>
+        </w:tc>
+        <w:tc>
+          <w:tcPr/>
+          <w:p>
+            <w:pPr>
+              <w:pStyle w:val="Compact"/>
+            </w:pPr>
+            <w:r>
+              <w:t xml:space="preserve">obsid, leader, entry, exit, etc.</w:t>
+            </w:r>
+          </w:p>
+        </w:tc>
+        <w:tc>
+          <w:tcPr/>
+          <w:p>
+            <w:pPr>
+              <w:pStyle w:val="Compact"/>
+            </w:pPr>
+            <w:r>
+              <w:t xml:space="preserve">Missing = dyad-year outside Archigos coverage. Not a gap.</w:t>
+            </w:r>
+          </w:p>
+        </w:tc>
+      </w:tr>
+      <w:tr>
+        <w:tc>
+          <w:tcPr/>
+          <w:p>
+            <w:pPr>
+              <w:pStyle w:val="Compact"/>
+            </w:pPr>
+            <w:r>
+              <w:t xml:space="preserve">Colgan leader variables</w:t>
+            </w:r>
+          </w:p>
+        </w:tc>
+        <w:tc>
+          <w:tcPr/>
+          <w:p>
+            <w:pPr>
+              <w:pStyle w:val="Compact"/>
+            </w:pPr>
+            <w:r>
+              <w:t xml:space="preserve">revolutionaryleader, chg_*, revage, etc.</w:t>
+            </w:r>
+          </w:p>
+        </w:tc>
+        <w:tc>
+          <w:tcPr/>
+          <w:p>
+            <w:pPr>
+              <w:pStyle w:val="Compact"/>
+            </w:pPr>
+            <w:r>
+              <w:t xml:space="preserve">Missing = leader not in Colgan dataset or not a revolutionary leader.</w:t>
+            </w:r>
+          </w:p>
+        </w:tc>
+      </w:tr>
+      <w:tr>
+        <w:tc>
+          <w:tcPr/>
+          <w:p>
+            <w:pPr>
+              <w:pStyle w:val="Compact"/>
+            </w:pPr>
+            <w:r>
+              <w:t xml:space="preserve">ATOP treaty identifiers</w:t>
+            </w:r>
+          </w:p>
+        </w:tc>
+        <w:tc>
+          <w:tcPr/>
+          <w:p>
+            <w:pPr>
+              <w:pStyle w:val="Compact"/>
+            </w:pPr>
+            <w:r>
+              <w:t xml:space="preserve">ddyad, transyr, atopid1–7, version</w:t>
+            </w:r>
+          </w:p>
+        </w:tc>
+        <w:tc>
+          <w:tcPr/>
+          <w:p>
+            <w:pPr>
+              <w:pStyle w:val="Compact"/>
+            </w:pPr>
+            <w:r>
+              <w:t xml:space="preserve">Missing = no alliance exists. Binary alliance indicators (atopally, defense, etc.) are zero-filled separately.</w:t>
+            </w:r>
+          </w:p>
+        </w:tc>
+      </w:tr>
+      <w:tr>
+        <w:tc>
+          <w:tcPr/>
+          <w:p>
+            <w:pPr>
+              <w:pStyle w:val="Compact"/>
+            </w:pPr>
+            <w:r>
+              <w:t xml:space="preserve">Internet censorship</w:t>
+            </w:r>
+          </w:p>
+        </w:tc>
+        <w:tc>
+          <w:tcPr/>
+          <w:p>
+            <w:pPr>
+              <w:pStyle w:val="Compact"/>
+            </w:pPr>
+            <w:r>
+              <w:t xml:space="preserve">v2mecenefi_a/b</w:t>
+            </w:r>
+          </w:p>
+        </w:tc>
+        <w:tc>
+          <w:tcPr/>
+          <w:p>
+            <w:pPr>
+              <w:pStyle w:val="Compact"/>
+            </w:pPr>
+            <w:r>
+              <w:t xml:space="preserve">Structurally absent for the pre-internet era. Not a gap.</w:t>
+            </w:r>
+          </w:p>
+        </w:tc>
+      </w:tr>
+      <w:tr>
+        <w:tc>
+          <w:tcPr/>
+          <w:p>
+            <w:pPr>
+              <w:pStyle w:val="Compact"/>
+            </w:pPr>
+            <w:r>
+              <w:t xml:space="preserve">Variables with &gt;80% missing</w:t>
+            </w:r>
+          </w:p>
+        </w:tc>
+        <w:tc>
+          <w:tcPr/>
+          <w:p>
+            <w:pPr>
+              <w:pStyle w:val="Compact"/>
+            </w:pPr>
+            <w:r>
+              <w:t xml:space="preserve">Any variable exceeding 80% NA</w:t>
+            </w:r>
+          </w:p>
+        </w:tc>
+        <w:tc>
+          <w:tcPr/>
+          <w:p>
+            <w:pPr>
+              <w:pStyle w:val="Compact"/>
+            </w:pPr>
+            <w:r>
+              <w:t xml:space="preserve">Insufficient observed data for reliable imputation.</w:t>
+            </w:r>
+          </w:p>
+        </w:tc>
+      </w:tr>
+      <w:tr>
+        <w:tc>
+          <w:tcPr/>
+          <w:p>
+            <w:pPr>
+              <w:pStyle w:val="Compact"/>
+            </w:pPr>
+            <w:r>
+              <w:t xml:space="preserve">Character/text variables</w:t>
+            </w:r>
+          </w:p>
+        </w:tc>
+        <w:tc>
+          <w:tcPr/>
+          <w:p>
+            <w:pPr>
+              <w:pStyle w:val="Compact"/>
+            </w:pPr>
+            <w:r>
+              <w:t xml:space="preserve">All non-numeric columns</w:t>
+            </w:r>
+          </w:p>
+        </w:tc>
+        <w:tc>
+          <w:tcPr/>
+          <w:p>
+            <w:pPr>
+              <w:pStyle w:val="Compact"/>
+            </w:pPr>
+            <w:r>
+              <w:t xml:space="preserve">Cannot be interpolated.</w:t>
+            </w:r>
+          </w:p>
+        </w:tc>
+      </w:tr>
+      <w:tr>
+        <w:tc>
+          <w:tcPr/>
+          <w:p>
+            <w:pPr>
+              <w:pStyle w:val="Compact"/>
+            </w:pPr>
+            <w:r>
+              <w:t xml:space="preserve">Derived variables</w:t>
+            </w:r>
+          </w:p>
+        </w:tc>
+        <w:tc>
+          <w:tcPr/>
+          <w:p>
+            <w:pPr>
+              <w:pStyle w:val="Compact"/>
+            </w:pPr>
+            <w:r>
+              <w:t xml:space="preserve">rev_potential_a/b, targets_democracy, sidea_*, islm_dist, etc.</w:t>
+            </w:r>
+          </w:p>
+        </w:tc>
+        <w:tc>
+          <w:tcPr/>
+          <w:p>
+            <w:pPr>
+              <w:pStyle w:val="Compact"/>
+            </w:pPr>
+            <w:r>
+              <w:t xml:space="preserve">Not imputed directly — recomputed in Stage 4 from imputed base variables.</w:t>
+            </w:r>
+          </w:p>
+        </w:tc>
+      </w:tr>
+    </w:tbl>
+    <w:bookmarkEnd w:id="58"/>
+    <w:bookmarkStart w:id="59" w:name="stage-1-country-year-panel-interpolation"/>
+    <w:p>
+      <w:pPr>
+        <w:pStyle w:val="Heading3"/>
+      </w:pPr>
+      <w:r>
+        <w:t xml:space="preserve">16.3 Stage 1: Country-Year Panel Interpolation</w:t>
+      </w:r>
+    </w:p>
+    <w:p>
+      <w:pPr>
+        <w:pStyle w:val="FirstParagraph"/>
+      </w:pPr>
+      <w:r>
+        <w:rPr>
+          <w:b/>
+          <w:bCs/>
+        </w:rPr>
+        <w:t xml:space="preserve">Method:</w:t>
+      </w:r>
+      <w:r>
+        <w:t xml:space="preserve"> </w:t>
+      </w:r>
+      <w:r>
+        <w:t xml:space="preserve">Linear interpolation within each country's time series using R's</w:t>
+      </w:r>
+      <w:r>
+        <w:t xml:space="preserve"> </w:t>
+      </w:r>
+      <w:r>
+        <w:rPr>
+          <w:rStyle w:val="VerbatimChar"/>
+        </w:rPr>
+        <w:t xml:space="preserve">approx()</w:t>
+      </w:r>
+      <w:r>
+        <w:t xml:space="preserve"> </w:t>
+      </w:r>
+      <w:r>
+        <w:t xml:space="preserve">function with</w:t>
+      </w:r>
+      <w:r>
+        <w:t xml:space="preserve"> </w:t>
+      </w:r>
+      <w:r>
+        <w:rPr>
+          <w:rStyle w:val="VerbatimChar"/>
+        </w:rPr>
+        <w:t xml:space="preserve">rule = 2</w:t>
+      </w:r>
+      <w:r>
+        <w:t xml:space="preserve">.</w:t>
+      </w:r>
+    </w:p>
+    <w:p>
+      <w:pPr>
+        <w:pStyle w:val="BodyText"/>
+      </w:pPr>
+      <w:r>
+        <w:rPr>
+          <w:b/>
+          <w:bCs/>
+        </w:rPr>
+        <w:t xml:space="preserve">Logic:</w:t>
+      </w:r>
+      <w:r>
+        <w:t xml:space="preserve"> </w:t>
+      </w:r>
+      <w:r>
+        <w:t xml:space="preserve">For each eligible numeric variable, the script extracts a monadic country-year panel (one row per country per year), groups by country, and interpolates between observed values. At the edges of each country's time series:</w:t>
+      </w:r>
+      <w:r>
+        <w:t xml:space="preserve"> </w:t>
+      </w:r>
+      <w:r>
+        <w:t xml:space="preserve">- Years</w:t>
+      </w:r>
+      <w:r>
+        <w:t xml:space="preserve"> </w:t>
+      </w:r>
+      <w:r>
+        <w:rPr>
+          <w:b/>
+          <w:bCs/>
+        </w:rPr>
+        <w:t xml:space="preserve">before</w:t>
+      </w:r>
+      <w:r>
+        <w:t xml:space="preserve"> </w:t>
+      </w:r>
+      <w:r>
+        <w:t xml:space="preserve">the first observation receive the earliest observed value (carried backward).</w:t>
+      </w:r>
+      <w:r>
+        <w:t xml:space="preserve"> </w:t>
+      </w:r>
+      <w:r>
+        <w:t xml:space="preserve">- Years</w:t>
+      </w:r>
+      <w:r>
+        <w:t xml:space="preserve"> </w:t>
+      </w:r>
+      <w:r>
+        <w:rPr>
+          <w:b/>
+          <w:bCs/>
+        </w:rPr>
+        <w:t xml:space="preserve">after</w:t>
+      </w:r>
+      <w:r>
+        <w:t xml:space="preserve"> </w:t>
+      </w:r>
+      <w:r>
+        <w:t xml:space="preserve">the last observation receive the latest observed value (carried forward — LOCF).</w:t>
+      </w:r>
+    </w:p>
+    <w:p>
+      <w:pPr>
+        <w:pStyle w:val="BodyText"/>
+      </w:pPr>
+      <w:r>
+        <w:rPr>
+          <w:b/>
+          <w:bCs/>
+        </w:rPr>
+        <w:t xml:space="preserve">Scope:</w:t>
+      </w:r>
+      <w:r>
+        <w:t xml:space="preserve"> </w:t>
+      </w:r>
+      <w:r>
+        <w:t xml:space="preserve">Applied separately to Side A variables (grouped by COWcode_a) and Side B variables (grouped by COWcode_b). This ensures that imputation respects the monadic structure — a value imputed for country X in year Y is consistent across all dyads involving country X in that year.</w:t>
+      </w:r>
+    </w:p>
+    <w:p>
+      <w:pPr>
+        <w:pStyle w:val="BodyText"/>
+      </w:pPr>
+      <w:r>
+        <w:rPr>
+          <w:b/>
+          <w:bCs/>
+        </w:rPr>
+        <w:t xml:space="preserve">Rationale:</w:t>
+      </w:r>
+      <w:r>
+        <w:t xml:space="preserve"> </w:t>
+      </w:r>
+      <w:r>
+        <w:t xml:space="preserve">Most V-Dem and economic variables change gradually within a country. Linear interpolation between observed values is the most defensible assumption for filling 1–3 year gaps within an otherwise observed time series.</w:t>
+      </w:r>
+    </w:p>
+    <w:bookmarkEnd w:id="59"/>
+    <w:bookmarkStart w:id="60" w:name="stage-2-regional-year-median-fill"/>
+    <w:p>
+      <w:pPr>
+        <w:pStyle w:val="Heading3"/>
+      </w:pPr>
+      <w:r>
+        <w:t xml:space="preserve">16.4 Stage 2: Regional-Year Median Fill</w:t>
+      </w:r>
+    </w:p>
+    <w:p>
+      <w:pPr>
+        <w:pStyle w:val="FirstParagraph"/>
+      </w:pPr>
+      <w:r>
+        <w:rPr>
+          <w:b/>
+          <w:bCs/>
+        </w:rPr>
+        <w:t xml:space="preserve">Method:</w:t>
+      </w:r>
+      <w:r>
+        <w:t xml:space="preserve"> </w:t>
+      </w:r>
+      <w:r>
+        <w:t xml:space="preserve">For key V-Dem indices and CINC only, remaining missing values are filled with the median value from the same UN geographic region and year.</w:t>
+      </w:r>
+    </w:p>
+    <w:p>
+      <w:pPr>
+        <w:pStyle w:val="BodyText"/>
+      </w:pPr>
+      <w:r>
+        <w:rPr>
+          <w:b/>
+          <w:bCs/>
+        </w:rPr>
+        <w:t xml:space="preserve">Scope:</w:t>
+      </w:r>
+      <w:r>
+        <w:t xml:space="preserve"> </w:t>
+      </w:r>
+      <w:r>
+        <w:t xml:space="preserve">This stage only fires for countries with</w:t>
+      </w:r>
+      <w:r>
+        <w:t xml:space="preserve"> </w:t>
+      </w:r>
+      <w:r>
+        <w:rPr>
+          <w:b/>
+          <w:bCs/>
+        </w:rPr>
+        <w:t xml:space="preserve">no observed data at all</w:t>
+      </w:r>
+      <w:r>
+        <w:t xml:space="preserve"> </w:t>
+      </w:r>
+      <w:r>
+        <w:t xml:space="preserve">in the base variable — typically microstates or territories outside V-Dem's country coverage. Countries that had any observed data were already handled by Stage 1.</w:t>
+      </w:r>
+    </w:p>
+    <w:p>
+      <w:pPr>
+        <w:pStyle w:val="BodyText"/>
+      </w:pPr>
+      <w:r>
+        <w:rPr>
+          <w:b/>
+          <w:bCs/>
+        </w:rPr>
+        <w:t xml:space="preserve">Variables affected:</w:t>
+      </w:r>
+      <w:r>
+        <w:t xml:space="preserve"> </w:t>
+      </w:r>
+      <w:r>
+        <w:rPr>
+          <w:rStyle w:val="VerbatimChar"/>
+        </w:rPr>
+        <w:t xml:space="preserve">v2x_polyarchy</w:t>
+      </w:r>
+      <w:r>
+        <w:t xml:space="preserve">,</w:t>
+      </w:r>
+      <w:r>
+        <w:t xml:space="preserve"> </w:t>
+      </w:r>
+      <w:r>
+        <w:rPr>
+          <w:rStyle w:val="VerbatimChar"/>
+        </w:rPr>
+        <w:t xml:space="preserve">v2x_libdem</w:t>
+      </w:r>
+      <w:r>
+        <w:t xml:space="preserve">,</w:t>
+      </w:r>
+      <w:r>
+        <w:t xml:space="preserve"> </w:t>
+      </w:r>
+      <w:r>
+        <w:rPr>
+          <w:rStyle w:val="VerbatimChar"/>
+        </w:rPr>
+        <w:t xml:space="preserve">v2x_corr</w:t>
+      </w:r>
+      <w:r>
+        <w:t xml:space="preserve">,</w:t>
+      </w:r>
+      <w:r>
+        <w:t xml:space="preserve"> </w:t>
+      </w:r>
+      <w:r>
+        <w:rPr>
+          <w:rStyle w:val="VerbatimChar"/>
+        </w:rPr>
+        <w:t xml:space="preserve">v2x_rule</w:t>
+      </w:r>
+      <w:r>
+        <w:t xml:space="preserve">,</w:t>
+      </w:r>
+      <w:r>
+        <w:t xml:space="preserve"> </w:t>
+      </w:r>
+      <w:r>
+        <w:rPr>
+          <w:rStyle w:val="VerbatimChar"/>
+        </w:rPr>
+        <w:t xml:space="preserve">v2exl_legitideol</w:t>
+      </w:r>
+      <w:r>
+        <w:t xml:space="preserve">,</w:t>
+      </w:r>
+      <w:r>
+        <w:t xml:space="preserve"> </w:t>
+      </w:r>
+      <w:r>
+        <w:rPr>
+          <w:rStyle w:val="VerbatimChar"/>
+        </w:rPr>
+        <w:t xml:space="preserve">v2exl_legitlead</w:t>
+      </w:r>
+      <w:r>
+        <w:t xml:space="preserve">,</w:t>
+      </w:r>
+      <w:r>
+        <w:t xml:space="preserve"> </w:t>
+      </w:r>
+      <w:r>
+        <w:rPr>
+          <w:rStyle w:val="VerbatimChar"/>
+        </w:rPr>
+        <w:t xml:space="preserve">v2x_cspart</w:t>
+      </w:r>
+      <w:r>
+        <w:t xml:space="preserve">,</w:t>
+      </w:r>
+      <w:r>
+        <w:t xml:space="preserve"> </w:t>
+      </w:r>
+      <w:r>
+        <w:rPr>
+          <w:rStyle w:val="VerbatimChar"/>
+        </w:rPr>
+        <w:t xml:space="preserve">v2pepwrses</w:t>
+      </w:r>
+      <w:r>
+        <w:t xml:space="preserve">,</w:t>
+      </w:r>
+      <w:r>
+        <w:t xml:space="preserve"> </w:t>
+      </w:r>
+      <w:r>
+        <w:rPr>
+          <w:rStyle w:val="VerbatimChar"/>
+        </w:rPr>
+        <w:t xml:space="preserve">v2pepwrsoc</w:t>
+      </w:r>
+      <w:r>
+        <w:t xml:space="preserve">,</w:t>
+      </w:r>
+      <w:r>
+        <w:t xml:space="preserve"> </w:t>
+      </w:r>
+      <w:r>
+        <w:rPr>
+          <w:rStyle w:val="VerbatimChar"/>
+        </w:rPr>
+        <w:t xml:space="preserve">v2dlreason</w:t>
+      </w:r>
+      <w:r>
+        <w:t xml:space="preserve">,</w:t>
+      </w:r>
+      <w:r>
+        <w:t xml:space="preserve"> </w:t>
+      </w:r>
+      <w:r>
+        <w:rPr>
+          <w:rStyle w:val="VerbatimChar"/>
+        </w:rPr>
+        <w:t xml:space="preserve">v2exl_legitideolcr_0</w:t>
+      </w:r>
+      <w:r>
+        <w:t xml:space="preserve"> </w:t>
+      </w:r>
+      <w:r>
+        <w:t xml:space="preserve">through</w:t>
+      </w:r>
+      <w:r>
+        <w:t xml:space="preserve"> </w:t>
+      </w:r>
+      <w:r>
+        <w:rPr>
+          <w:rStyle w:val="VerbatimChar"/>
+        </w:rPr>
+        <w:t xml:space="preserve">_4</w:t>
+      </w:r>
+      <w:r>
+        <w:t xml:space="preserve">, and</w:t>
+      </w:r>
+      <w:r>
+        <w:t xml:space="preserve"> </w:t>
+      </w:r>
+      <w:r>
+        <w:rPr>
+          <w:rStyle w:val="VerbatimChar"/>
+        </w:rPr>
+        <w:t xml:space="preserve">cinc</w:t>
+      </w:r>
+      <w:r>
+        <w:t xml:space="preserve"> </w:t>
+      </w:r>
+      <w:r>
+        <w:t xml:space="preserve">(all with</w:t>
+      </w:r>
+      <w:r>
+        <w:t xml:space="preserve"> </w:t>
+      </w:r>
+      <w:r>
+        <w:rPr>
+          <w:rStyle w:val="VerbatimChar"/>
+        </w:rPr>
+        <w:t xml:space="preserve">_a</w:t>
+      </w:r>
+      <w:r>
+        <w:t xml:space="preserve"> </w:t>
+      </w:r>
+      <w:r>
+        <w:t xml:space="preserve">and</w:t>
+      </w:r>
+      <w:r>
+        <w:t xml:space="preserve"> </w:t>
+      </w:r>
+      <w:r>
+        <w:rPr>
+          <w:rStyle w:val="VerbatimChar"/>
+        </w:rPr>
+        <w:t xml:space="preserve">_b</w:t>
+      </w:r>
+      <w:r>
+        <w:t xml:space="preserve"> </w:t>
+      </w:r>
+      <w:r>
+        <w:t xml:space="preserve">suffixes).</w:t>
+      </w:r>
+    </w:p>
+    <w:p>
+      <w:pPr>
+        <w:pStyle w:val="BodyText"/>
+      </w:pPr>
+      <w:r>
+        <w:rPr>
+          <w:b/>
+          <w:bCs/>
+        </w:rPr>
+        <w:t xml:space="preserve">Rationale:</w:t>
+      </w:r>
+      <w:r>
+        <w:t xml:space="preserve"> </w:t>
+      </w:r>
+      <w:r>
+        <w:t xml:space="preserve">Regional medians provide a weak but defensible prior for countries with zero coverage. This prevents listwise deletion of entire dyads involving microstates or non-covered territories in downstream analysis.</w:t>
+      </w:r>
+    </w:p>
+    <w:bookmarkEnd w:id="60"/>
+    <w:bookmarkStart w:id="61" w:name="stage-3-derived-variable-recomputation"/>
+    <w:p>
+      <w:pPr>
+        <w:pStyle w:val="Heading3"/>
+      </w:pPr>
+      <w:r>
+        <w:t xml:space="preserve">16.5 Stage 3: Derived Variable Recomputation</w:t>
+      </w:r>
+    </w:p>
+    <w:p>
+      <w:pPr>
+        <w:pStyle w:val="FirstParagraph"/>
+      </w:pPr>
+      <w:r>
+        <w:t xml:space="preserve">After Stages 1–2, all derived variables are recomputed from their now-imputed base inputs. This ensures internal consistency — a change in an imputed</w:t>
+      </w:r>
+      <w:r>
+        <w:t xml:space="preserve"> </w:t>
+      </w:r>
+      <w:r>
+        <w:rPr>
+          <w:rStyle w:val="VerbatimChar"/>
+        </w:rPr>
+        <w:t xml:space="preserve">v2x_libdem_a</w:t>
+      </w:r>
+      <w:r>
+        <w:t xml:space="preserve"> </w:t>
+      </w:r>
+      <w:r>
+        <w:t xml:space="preserve">value propagates correctly to</w:t>
+      </w:r>
+      <w:r>
+        <w:t xml:space="preserve"> </w:t>
+      </w:r>
+      <w:r>
+        <w:rPr>
+          <w:rStyle w:val="VerbatimChar"/>
+        </w:rPr>
+        <w:t xml:space="preserve">targets_democracy</w:t>
+      </w:r>
+      <w:r>
+        <w:t xml:space="preserve">,</w:t>
+      </w:r>
+      <w:r>
+        <w:t xml:space="preserve"> </w:t>
+      </w:r>
+      <w:r>
+        <w:rPr>
+          <w:rStyle w:val="VerbatimChar"/>
+        </w:rPr>
+        <w:t xml:space="preserve">dem_constraint_inv_a</w:t>
+      </w:r>
+      <w:r>
+        <w:t xml:space="preserve">,</w:t>
+      </w:r>
+      <w:r>
+        <w:t xml:space="preserve"> </w:t>
+      </w:r>
+      <w:r>
+        <w:rPr>
+          <w:rStyle w:val="VerbatimChar"/>
+        </w:rPr>
+        <w:t xml:space="preserve">rev_potential_a</w:t>
+      </w:r>
+      <w:r>
+        <w:t xml:space="preserve">, and</w:t>
+      </w:r>
+      <w:r>
+        <w:t xml:space="preserve"> </w:t>
+      </w:r>
+      <w:r>
+        <w:rPr>
+          <w:rStyle w:val="VerbatimChar"/>
+        </w:rPr>
+        <w:t xml:space="preserve">revisionism_distance</w:t>
+      </w:r>
+      <w:r>
+        <w:t xml:space="preserve">.</w:t>
+      </w:r>
+    </w:p>
+    <w:tbl>
+      <w:tblPr>
+        <w:tblStyle w:val="Table"/>
+        <w:tblW w:type="auto" w:w="0"/>
+        <w:tblLook w:firstRow="1" w:lastRow="0" w:firstColumn="0" w:lastColumn="0" w:noHBand="0" w:noVBand="0" w:val="0020"/>
+      </w:tblPr>
+      <w:tblGrid>
+        <w:gridCol w:w="3960"/>
+        <w:gridCol w:w="3960"/>
+      </w:tblGrid>
+      <w:tr>
+        <w:trPr>
+          <w:tblHeader w:val="on"/>
+        </w:trPr>
+        <w:tc>
+          <w:tcPr/>
+          <w:p>
+            <w:pPr>
+              <w:pStyle w:val="Compact"/>
+            </w:pPr>
+            <w:r>
+              <w:t xml:space="preserve">Derived variable</w:t>
+            </w:r>
+          </w:p>
+        </w:tc>
+        <w:tc>
+          <w:tcPr/>
+          <w:p>
+            <w:pPr>
+              <w:pStyle w:val="Compact"/>
+            </w:pPr>
+            <w:r>
+              <w:t xml:space="preserve">Recomputed from</w:t>
+            </w:r>
+          </w:p>
+        </w:tc>
+      </w:tr>
+      <w:tr>
+        <w:tc>
+          <w:tcPr/>
+          <w:p>
+            <w:pPr>
+              <w:pStyle w:val="Compact"/>
+            </w:pPr>
+            <w:r>
+              <w:t xml:space="preserve">sidea_revisionist_domestic</w:t>
+            </w:r>
+          </w:p>
+        </w:tc>
+        <w:tc>
+          <w:tcPr/>
+          <w:p>
+            <w:pPr>
+              <w:pStyle w:val="Compact"/>
+            </w:pPr>
+            <w:r>
+              <w:t xml:space="preserve">v2exl_legitideol_a</w:t>
+            </w:r>
+          </w:p>
+        </w:tc>
+      </w:tr>
+      <w:tr>
+        <w:tc>
+          <w:tcPr/>
+          <w:p>
+            <w:pPr>
+              <w:pStyle w:val="Compact"/>
+            </w:pPr>
+            <w:r>
+              <w:t xml:space="preserve">sidea_nationalist_revisionist_domestic</w:t>
+            </w:r>
+          </w:p>
+        </w:tc>
+        <w:tc>
+          <w:tcPr/>
+          <w:p>
+            <w:pPr>
+              <w:pStyle w:val="Compact"/>
+            </w:pPr>
+            <w:r>
+              <w:t xml:space="preserve">v2exl_legitideolcr_0_a</w:t>
+            </w:r>
+          </w:p>
+        </w:tc>
+      </w:tr>
+      <w:tr>
+        <w:tc>
+          <w:tcPr/>
+          <w:p>
+            <w:pPr>
+              <w:pStyle w:val="Compact"/>
+            </w:pPr>
+            <w:r>
+              <w:t xml:space="preserve">sidea_socialist_revisionist_domestic</w:t>
+            </w:r>
+          </w:p>
+        </w:tc>
+        <w:tc>
+          <w:tcPr/>
+          <w:p>
+            <w:pPr>
+              <w:pStyle w:val="Compact"/>
+            </w:pPr>
+            <w:r>
+              <w:t xml:space="preserve">v2exl_legitideolcr_1_a</w:t>
+            </w:r>
+          </w:p>
+        </w:tc>
+      </w:tr>
+      <w:tr>
+        <w:tc>
+          <w:tcPr/>
+          <w:p>
+            <w:pPr>
+              <w:pStyle w:val="Compact"/>
+            </w:pPr>
+            <w:r>
+              <w:t xml:space="preserve">sidea_reactionary_revisionist_domestic</w:t>
+            </w:r>
+          </w:p>
+        </w:tc>
+        <w:tc>
+          <w:tcPr/>
+          <w:p>
+            <w:pPr>
+              <w:pStyle w:val="Compact"/>
+            </w:pPr>
+            <w:r>
+              <w:t xml:space="preserve">v2exl_legitideolcr_2_a</w:t>
+            </w:r>
+          </w:p>
+        </w:tc>
+      </w:tr>
+      <w:tr>
+        <w:tc>
+          <w:tcPr/>
+          <w:p>
+            <w:pPr>
+              <w:pStyle w:val="Compact"/>
+            </w:pPr>
+            <w:r>
+              <w:t xml:space="preserve">sidea_separatist_revisionist_domestic</w:t>
+            </w:r>
+          </w:p>
+        </w:tc>
+        <w:tc>
+          <w:tcPr/>
+          <w:p>
+            <w:pPr>
+              <w:pStyle w:val="Compact"/>
+            </w:pPr>
+            <w:r>
+              <w:t xml:space="preserve">v2exl_legitideolcr_3_a</w:t>
+            </w:r>
+          </w:p>
+        </w:tc>
+      </w:tr>
+      <w:tr>
+        <w:tc>
+          <w:tcPr/>
+          <w:p>
+            <w:pPr>
+              <w:pStyle w:val="Compact"/>
+            </w:pPr>
+            <w:r>
+              <w:t xml:space="preserve">sidea_religious_revisionist_domestic</w:t>
+            </w:r>
+          </w:p>
+        </w:tc>
+        <w:tc>
+          <w:tcPr/>
+          <w:p>
+            <w:pPr>
+              <w:pStyle w:val="Compact"/>
+            </w:pPr>
+            <w:r>
+              <w:t xml:space="preserve">v2exl_legitideolcr_4_a</w:t>
+            </w:r>
+          </w:p>
+        </w:tc>
+      </w:tr>
+      <w:tr>
+        <w:tc>
+          <w:tcPr/>
+          <w:p>
+            <w:pPr>
+              <w:pStyle w:val="Compact"/>
+            </w:pPr>
+            <w:r>
+              <w:t xml:space="preserve">sidea_dynamic_leader</w:t>
+            </w:r>
+          </w:p>
+        </w:tc>
+        <w:tc>
+          <w:tcPr/>
+          <w:p>
+            <w:pPr>
+              <w:pStyle w:val="Compact"/>
+            </w:pPr>
+            <w:r>
+              <w:t xml:space="preserve">v2exl_legitlead_a</w:t>
+            </w:r>
+          </w:p>
+        </w:tc>
+      </w:tr>
+      <w:tr>
+        <w:tc>
+          <w:tcPr/>
+          <w:p>
+            <w:pPr>
+              <w:pStyle w:val="Compact"/>
+            </w:pPr>
+            <w:r>
+              <w:t xml:space="preserve">sidea_party_elite_support</w:t>
+            </w:r>
+          </w:p>
+        </w:tc>
+        <w:tc>
+          <w:tcPr/>
+          <w:p>
+            <w:pPr>
+              <w:pStyle w:val="Compact"/>
+            </w:pPr>
+            <w:r>
+              <w:t xml:space="preserve">v2pepwrses_a</w:t>
+            </w:r>
+          </w:p>
+        </w:tc>
+      </w:tr>
+      <w:tr>
+        <w:tc>
+          <w:tcPr/>
+          <w:p>
+            <w:pPr>
+              <w:pStyle w:val="Compact"/>
+            </w:pPr>
+            <w:r>
+              <w:t xml:space="preserve">sidea_ethnic_racial_support</w:t>
+            </w:r>
+          </w:p>
+        </w:tc>
+        <w:tc>
+          <w:tcPr/>
+          <w:p>
+            <w:pPr>
+              <w:pStyle w:val="Compact"/>
+            </w:pPr>
+            <w:r>
+              <w:t xml:space="preserve">v2pepwrsoc_a</w:t>
+            </w:r>
+          </w:p>
+        </w:tc>
+      </w:tr>
+      <w:tr>
+        <w:tc>
+          <w:tcPr/>
+          <w:p>
+            <w:pPr>
+              <w:pStyle w:val="Compact"/>
+            </w:pPr>
+            <w:r>
+              <w:t xml:space="preserve">sidea_rural_worker_support</w:t>
+            </w:r>
+          </w:p>
+        </w:tc>
+        <w:tc>
+          <w:tcPr/>
+          <w:p>
+            <w:pPr>
+              <w:pStyle w:val="Compact"/>
+            </w:pPr>
+            <w:r>
+              <w:t xml:space="preserve">v2x_cspart_a</w:t>
+            </w:r>
+          </w:p>
+        </w:tc>
+      </w:tr>
+      <w:tr>
+        <w:tc>
+          <w:tcPr/>
+          <w:p>
+            <w:pPr>
+              <w:pStyle w:val="Compact"/>
+            </w:pPr>
+            <w:r>
+              <w:t xml:space="preserve">sidea_military_support</w:t>
+            </w:r>
+          </w:p>
+        </w:tc>
+        <w:tc>
+          <w:tcPr/>
+          <w:p>
+            <w:pPr>
+              <w:pStyle w:val="Compact"/>
+            </w:pPr>
+            <w:r>
+              <w:t xml:space="preserve">cinc_a</w:t>
+            </w:r>
+          </w:p>
+        </w:tc>
+      </w:tr>
+      <w:tr>
+        <w:tc>
+          <w:tcPr/>
+          <w:p>
+            <w:pPr>
+              <w:pStyle w:val="Compact"/>
+            </w:pPr>
+            <w:r>
+              <w:t xml:space="preserve">sidea_religious_support</w:t>
+            </w:r>
+          </w:p>
+        </w:tc>
+        <w:tc>
+          <w:tcPr/>
+          <w:p>
+            <w:pPr>
+              <w:pStyle w:val="Compact"/>
+            </w:pPr>
+            <w:r>
+              <w:t xml:space="preserve">v2regsupgroups_7_a</w:t>
+            </w:r>
+          </w:p>
+        </w:tc>
+      </w:tr>
+      <w:tr>
+        <w:tc>
+          <w:tcPr/>
+          <w:p>
+            <w:pPr>
+              <w:pStyle w:val="Compact"/>
+            </w:pPr>
+            <w:r>
+              <w:t xml:space="preserve">sidea_winning_coalition_size</w:t>
+            </w:r>
+          </w:p>
+        </w:tc>
+        <w:tc>
+          <w:tcPr/>
+          <w:p>
+            <w:pPr>
+              <w:pStyle w:val="Compact"/>
+            </w:pPr>
+            <w:r>
+              <w:t xml:space="preserve">v2dlreason_a</w:t>
+            </w:r>
+          </w:p>
+        </w:tc>
+      </w:tr>
+      <w:tr>
+        <w:tc>
+          <w:tcPr/>
+          <w:p>
+            <w:pPr>
+              <w:pStyle w:val="Compact"/>
+            </w:pPr>
+            <w:r>
+              <w:t xml:space="preserve">targets_democracy</w:t>
+            </w:r>
+          </w:p>
+        </w:tc>
+        <w:tc>
+          <w:tcPr/>
+          <w:p>
+            <w:pPr>
+              <w:pStyle w:val="Compact"/>
+            </w:pPr>
+            <w:r>
+              <w:t xml:space="preserve">v2x_libdem_a &lt; 0.3 AND v2x_libdem_b ≥ 0.5</w:t>
+            </w:r>
+          </w:p>
+        </w:tc>
+      </w:tr>
+      <w:tr>
+        <w:tc>
+          <w:tcPr/>
+          <w:p>
+            <w:pPr>
+              <w:pStyle w:val="Compact"/>
+            </w:pPr>
+            <w:r>
+              <w:t xml:space="preserve">ideol_extremity_a/b</w:t>
+            </w:r>
+          </w:p>
+        </w:tc>
+        <w:tc>
+          <w:tcPr/>
+          <w:p>
+            <w:pPr>
+              <w:pStyle w:val="Compact"/>
+            </w:pPr>
+            <w:r>
+              <w:t xml:space="preserve">abs(v2exl_legitideol − annual global median)</w:t>
+            </w:r>
+          </w:p>
+        </w:tc>
+      </w:tr>
+      <w:tr>
+        <w:tc>
+          <w:tcPr/>
+          <w:p>
+            <w:pPr>
+              <w:pStyle w:val="Compact"/>
+            </w:pPr>
+            <w:r>
+              <w:t xml:space="preserve">dem_constraint_inv_a/b</w:t>
+            </w:r>
+          </w:p>
+        </w:tc>
+        <w:tc>
+          <w:tcPr/>
+          <w:p>
+            <w:pPr>
+              <w:pStyle w:val="Compact"/>
+            </w:pPr>
+            <w:r>
+              <w:t xml:space="preserve">1 − v2x_libdem</w:t>
+            </w:r>
+          </w:p>
+        </w:tc>
+      </w:tr>
+      <w:tr>
+        <w:tc>
+          <w:tcPr/>
+          <w:p>
+            <w:pPr>
+              <w:pStyle w:val="Compact"/>
+            </w:pPr>
+            <w:r>
+              <w:t xml:space="preserve">z_legit_a/b, z_dem_a/b, z_ext_a/b</w:t>
+            </w:r>
+          </w:p>
+        </w:tc>
+        <w:tc>
+          <w:tcPr/>
+          <w:p>
+            <w:pPr>
+              <w:pStyle w:val="Compact"/>
+            </w:pPr>
+            <w:r>
+              <w:t xml:space="preserve">Z-scores of above components</w:t>
+            </w:r>
+          </w:p>
+        </w:tc>
+      </w:tr>
+      <w:tr>
+        <w:tc>
+          <w:tcPr/>
+          <w:p>
+            <w:pPr>
+              <w:pStyle w:val="Compact"/>
+            </w:pPr>
+            <w:r>
+              <w:t xml:space="preserve">rev_potential_a/b</w:t>
+            </w:r>
+          </w:p>
+        </w:tc>
+        <w:tc>
+          <w:tcPr/>
+          <w:p>
+            <w:pPr>
+              <w:pStyle w:val="Compact"/>
+            </w:pPr>
+            <w:r>
+              <w:t xml:space="preserve">(z_legit + z_dem + z_ext) / 3</w:t>
+            </w:r>
+          </w:p>
+        </w:tc>
+      </w:tr>
+      <w:tr>
+        <w:tc>
+          <w:tcPr/>
+          <w:p>
+            <w:pPr>
+              <w:pStyle w:val="Compact"/>
+            </w:pPr>
+            <w:r>
+              <w:t xml:space="preserve">revisionism_distance</w:t>
+            </w:r>
+          </w:p>
+        </w:tc>
+        <w:tc>
+          <w:tcPr/>
+          <w:p>
+            <w:pPr>
+              <w:pStyle w:val="Compact"/>
+            </w:pPr>
+            <w:r>
+              <w:t xml:space="preserve">abs(rev_potential_a − rev_potential_b)</w:t>
+            </w:r>
+          </w:p>
+        </w:tc>
+      </w:tr>
+      <w:tr>
+        <w:tc>
+          <w:tcPr/>
+          <w:p>
+            <w:pPr>
+              <w:pStyle w:val="Compact"/>
+            </w:pPr>
+            <w:r>
+              <w:t xml:space="preserve">islm_dist</w:t>
+            </w:r>
+          </w:p>
+        </w:tc>
+        <w:tc>
+          <w:tcPr/>
+          <w:p>
+            <w:pPr>
+              <w:pStyle w:val="Compact"/>
+            </w:pPr>
+            <w:r>
+              <w:t xml:space="preserve">abs(islmgenpct_a − islmgenpct_b)</w:t>
+            </w:r>
+          </w:p>
+        </w:tc>
+      </w:tr>
+      <w:tr>
+        <w:tc>
+          <w:tcPr/>
+          <w:p>
+            <w:pPr>
+              <w:pStyle w:val="Compact"/>
+            </w:pPr>
+            <w:r>
+              <w:t xml:space="preserve">chrst_dist</w:t>
+            </w:r>
+          </w:p>
+        </w:tc>
+        <w:tc>
+          <w:tcPr/>
+          <w:p>
+            <w:pPr>
+              <w:pStyle w:val="Compact"/>
+            </w:pPr>
+            <w:r>
+              <w:t xml:space="preserve">abs(chrstgenpct_a − chrstgenpct_b)</w:t>
+            </w:r>
+          </w:p>
+        </w:tc>
+      </w:tr>
+    </w:tbl>
+    <w:bookmarkEnd w:id="61"/>
+    <w:bookmarkStart w:id="62" w:name="stage-4-export-and-diagnostics"/>
+    <w:p>
+      <w:pPr>
+        <w:pStyle w:val="Heading3"/>
+      </w:pPr>
+      <w:r>
+        <w:t xml:space="preserve">16.6 Stage 4: Export and Diagnostics</w:t>
+      </w:r>
+    </w:p>
+    <w:p>
+      <w:pPr>
+        <w:pStyle w:val="FirstParagraph"/>
+      </w:pPr>
+      <w:r>
+        <w:t xml:space="preserve">The script overwrites</w:t>
+      </w:r>
+      <w:r>
+        <w:t xml:space="preserve"> </w:t>
+      </w:r>
+      <w:r>
+        <w:rPr>
+          <w:rStyle w:val="VerbatimChar"/>
+        </w:rPr>
+        <w:t xml:space="preserve">data/GRAVE_D_Master.rds</w:t>
+      </w:r>
+      <w:r>
+        <w:t xml:space="preserve"> </w:t>
+      </w:r>
+      <w:r>
+        <w:t xml:space="preserve">and</w:t>
+      </w:r>
+      <w:r>
+        <w:t xml:space="preserve"> </w:t>
+      </w:r>
+      <w:r>
+        <w:rPr>
+          <w:rStyle w:val="VerbatimChar"/>
+        </w:rPr>
+        <w:t xml:space="preserve">ready_data/GRAVE_D_Master.csv</w:t>
+      </w:r>
+      <w:r>
+        <w:t xml:space="preserve"> </w:t>
+      </w:r>
+      <w:r>
+        <w:t xml:space="preserve">with the imputed versions and prints a diagnostic table showing remaining NA counts and percentages for key analysis variables.</w:t>
+      </w:r>
+    </w:p>
+    <w:p>
+      <w:pPr>
+        <w:pStyle w:val="BodyText"/>
+      </w:pPr>
+      <w:r>
+        <w:rPr>
+          <w:b/>
+          <w:bCs/>
+        </w:rPr>
+        <w:t xml:space="preserve">Note:</w:t>
+      </w:r>
+      <w:r>
+        <w:t xml:space="preserve"> </w:t>
+      </w:r>
+      <w:r>
+        <w:t xml:space="preserve">The</w:t>
+      </w:r>
+      <w:r>
+        <w:t xml:space="preserve"> </w:t>
+      </w:r>
+      <w:r>
+        <w:rPr>
+          <w:rStyle w:val="VerbatimChar"/>
+        </w:rPr>
+        <w:t xml:space="preserve">GRAVE_D_Master_with_Leaders.csv</w:t>
+      </w:r>
+      <w:r>
+        <w:t xml:space="preserve"> </w:t>
+      </w:r>
+      <w:r>
+        <w:t xml:space="preserve">export (which adds Side B leader data) must be regenerated after imputation by re-running the leader merge block from</w:t>
+      </w:r>
+      <w:r>
+        <w:t xml:space="preserve"> </w:t>
+      </w:r>
+      <w:r>
+        <w:rPr>
+          <w:rStyle w:val="VerbatimChar"/>
+        </w:rPr>
+        <w:t xml:space="preserve">05_build_master.R</w:t>
+      </w:r>
+      <w:r>
+        <w:t xml:space="preserve"> </w:t>
+      </w:r>
+      <w:r>
+        <w:t xml:space="preserve">or appending it to the end of</w:t>
+      </w:r>
+      <w:r>
+        <w:t xml:space="preserve"> </w:t>
+      </w:r>
+      <w:r>
+        <w:rPr>
+          <w:rStyle w:val="VerbatimChar"/>
+        </w:rPr>
+        <w:t xml:space="preserve">06_impute_controls.R</w:t>
+      </w:r>
+      <w:r>
+        <w:t xml:space="preserve">.</w:t>
+      </w:r>
+    </w:p>
+    <w:bookmarkEnd w:id="62"/>
+    <w:bookmarkStart w:id="63" w:name="remaining-nas-in-key-analysis-variables"/>
+    <w:p>
+      <w:pPr>
+        <w:pStyle w:val="Heading3"/>
+      </w:pPr>
+      <w:r>
+        <w:t xml:space="preserve">16.7 Remaining NAs in key analysis variables</w:t>
+      </w:r>
+    </w:p>
+    <w:p>
+      <w:pPr>
+        <w:pStyle w:val="FirstParagraph"/>
+      </w:pPr>
+      <w:r>
+        <w:t xml:space="preserve">v2x_libdem_a 59198 ( 3.5%)</w:t>
+      </w:r>
+      <w:r>
+        <w:t xml:space="preserve"> </w:t>
+      </w:r>
+      <w:r>
+        <w:t xml:space="preserve">v2x_libdem_b 59198 ( 3.5%)</w:t>
+      </w:r>
+      <w:r>
+        <w:t xml:space="preserve"> </w:t>
+      </w:r>
+      <w:r>
+        <w:t xml:space="preserve">v2exl_legitideol_a 59198 ( 3.5%)</w:t>
+      </w:r>
+      <w:r>
+        <w:t xml:space="preserve"> </w:t>
+      </w:r>
+      <w:r>
+        <w:t xml:space="preserve">v2exl_legitideol_b 59198 ( 3.5%)</w:t>
+      </w:r>
+      <w:r>
+        <w:t xml:space="preserve"> </w:t>
+      </w:r>
+      <w:r>
+        <w:t xml:space="preserve">cinc_a 0 ( 0.0%)</w:t>
+      </w:r>
+      <w:r>
+        <w:t xml:space="preserve"> </w:t>
+      </w:r>
+      <w:r>
+        <w:t xml:space="preserve">cinc_b 0 ( 0.0%)</w:t>
+      </w:r>
+      <w:r>
+        <w:t xml:space="preserve"> </w:t>
+      </w:r>
+      <w:r>
+        <w:t xml:space="preserve">rev_potential_a 59198 ( 3.5%)</w:t>
+      </w:r>
+      <w:r>
+        <w:t xml:space="preserve"> </w:t>
+      </w:r>
+      <w:r>
+        <w:t xml:space="preserve">rev_potential_b 59198 ( 3.5%)</w:t>
+      </w:r>
+      <w:r>
+        <w:t xml:space="preserve"> </w:t>
+      </w:r>
+      <w:r>
+        <w:t xml:space="preserve">revisionism_distance 116482 ( 6.8%)</w:t>
+      </w:r>
+      <w:r>
+        <w:t xml:space="preserve"> </w:t>
+      </w:r>
+      <w:r>
+        <w:t xml:space="preserve">targets_democracy 0 ( 0.0%)</w:t>
+      </w:r>
+      <w:r>
+        <w:t xml:space="preserve"> </w:t>
+      </w:r>
+      <w:r>
+        <w:t xml:space="preserve">sidea_revisionist_domestic 59198 ( 3.5%)</w:t>
+      </w:r>
+      <w:r>
+        <w:t xml:space="preserve"> </w:t>
+      </w:r>
+      <w:r>
+        <w:t xml:space="preserve">sidea_nationalist_revisionist_domestic 59198 ( 3.5%)</w:t>
+      </w:r>
+      <w:r>
+        <w:t xml:space="preserve"> </w:t>
+      </w:r>
+      <w:r>
+        <w:t xml:space="preserve">sidea_military_support 0 ( 0.0%)</w:t>
+      </w:r>
+      <w:r>
+        <w:t xml:space="preserve"> </w:t>
+      </w:r>
+      <w:r>
+        <w:t xml:space="preserve">sidea_religious_support 166631 ( 9.8%)</w:t>
+      </w:r>
+      <w:r>
+        <w:t xml:space="preserve"> </w:t>
+      </w:r>
+      <w:r>
+        <w:t xml:space="preserve">chrstgenpct_a 11941 ( 0.7%)</w:t>
+      </w:r>
+      <w:r>
+        <w:t xml:space="preserve"> </w:t>
+      </w:r>
+      <w:r>
+        <w:t xml:space="preserve">islmgenpct_a 11941 ( 0.7%)</w:t>
+      </w:r>
+      <w:r>
+        <w:t xml:space="preserve"> </w:t>
+      </w:r>
+      <w:r>
+        <w:t xml:space="preserve">islm_dist 23862 ( 1.4%)</w:t>
+      </w:r>
+      <w:r>
+        <w:t xml:space="preserve"> </w:t>
+      </w:r>
+      <w:r>
+        <w:t xml:space="preserve">chrst_dist 23862 ( 1.4%)</w:t>
+      </w:r>
+    </w:p>
+    <w:bookmarkEnd w:id="63"/>
+    <w:bookmarkEnd w:id="64"/>
     <w:sectPr>
       <w:footnotePr>
         <w:numRestart w:val="eachSect"/>

</xml_diff>